<commit_message>
Mention the live dashboard in the report and slides
Adds the deployed dashboard URL to the report cover and repository section and to the closing slide, and regenerates the report data (25 commits at generation), Word and PDF report and the deck.
</commit_message>
<xml_diff>
--- a/docs/report/AML_Project_Report.docx
+++ b/docs/report/AML_Project_Report.docx
@@ -153,6 +153,29 @@
           <w:sz w:val="21"/>
           <w:szCs w:val="21"/>
         </w:rPr>
+        <w:t xml:space="preserve">Live dashboard: </w:t>
+      </w:r>
+      <w:r>
+        <w:rPr>
+          <w:rFonts w:ascii="Calibri" w:cs="Calibri" w:eastAsia="Calibri" w:hAnsi="Calibri"/>
+          <w:sz w:val="21"/>
+          <w:szCs w:val="21"/>
+        </w:rPr>
+        <w:t xml:space="preserve">https://trafficflowamldl.streamlit.app</w:t>
+      </w:r>
+    </w:p>
+    <w:p>
+      <w:pPr>
+        <w:spacing w:after="120" w:line="276"/>
+      </w:pPr>
+      <w:r>
+        <w:rPr>
+          <w:rFonts w:ascii="Calibri" w:cs="Calibri" w:eastAsia="Calibri" w:hAnsi="Calibri"/>
+          <w:b/>
+          <w:bCs/>
+          <w:sz w:val="21"/>
+          <w:szCs w:val="21"/>
+        </w:rPr>
         <w:t xml:space="preserve">Report generated from commit: </w:t>
       </w:r>
       <w:r>
@@ -161,7 +184,7 @@
           <w:sz w:val="21"/>
           <w:szCs w:val="21"/>
         </w:rPr>
-        <w:t xml:space="preserve">101ec90 (23 commits at that point)</w:t>
+        <w:t xml:space="preserve">74cf9f1 (25 commits at that point)</w:t>
       </w:r>
     </w:p>
     <w:p>
@@ -2049,7 +2072,7 @@
           <w:sz w:val="21"/>
           <w:szCs w:val="21"/>
         </w:rPr>
-        <w:t xml:space="preserve">23 commits, 39 automated tests (12 of them leakage tests), make targets for every stage, and an interactive dashboard.</w:t>
+        <w:t xml:space="preserve">25 commits, 39 automated tests (12 of them leakage tests), make targets for every stage, and an interactive dashboard.</w:t>
       </w:r>
     </w:p>
     <w:p>
@@ -17061,7 +17084,7 @@
           <w:sz w:val="21"/>
           <w:szCs w:val="21"/>
         </w:rPr>
-        <w:t xml:space="preserve">The repository (https://github.com/ManasSaxena14/TrafficFlowControl_AIML-DL_T036) holds 1,988 lines of source in src/, 450 lines of tests, and a 808-line dashboard. Large intermediate data (data/processed, about 2.5 GB per protocol) is git-ignored and rebuilt by the make targets.</w:t>
+        <w:t xml:space="preserve">The repository (https://github.com/ManasSaxena14/TrafficFlowControl_AIML-DL_T036) holds 1,988 lines of source in src/, 450 lines of tests, and a 808-line Streamlit dashboard, deployed at https://trafficflowamldl.streamlit.app. Large intermediate data (data/processed, about 2.5 GB per protocol) is git-ignored and rebuilt by the make targets.</w:t>
       </w:r>
     </w:p>
     <w:p>
@@ -17939,7 +17962,7 @@
                 <w:sz w:val="18"/>
                 <w:szCs w:val="18"/>
               </w:rPr>
-              <w:t xml:space="preserve">Interactive Streamlit dashboard over the saved results</w:t>
+              <w:t xml:space="preserve">Interactive Streamlit dashboard over the saved results (live at https://trafficflowamldl.streamlit.app)</w:t>
             </w:r>
           </w:p>
         </w:tc>
@@ -26157,7 +26180,7 @@
           <w:sz w:val="21"/>
           <w:szCs w:val="21"/>
         </w:rPr>
-        <w:t xml:space="preserve">23 commits at the time of generation (commit 101ec90). Source: git log.</w:t>
+        <w:t xml:space="preserve">25 commits at the time of generation (commit 74cf9f1). Source: git log.</w:t>
       </w:r>
     </w:p>
     <w:tbl>
@@ -29427,6 +29450,276 @@
                 <w:szCs w:val="16"/>
               </w:rPr>
               <w:t xml:space="preserve">Integrate the Streamlit dashboard and fix the peak-ratio range</w:t>
+            </w:r>
+          </w:p>
+        </w:tc>
+      </w:tr>
+      <w:tr>
+        <w:trPr>
+          <w:cantSplit/>
+        </w:trPr>
+        <w:tc>
+          <w:tcPr>
+            <w:tcW w:type="dxa" w:w="900"/>
+            <w:tcBorders>
+              <w:top w:val="single" w:color="C9D2DF" w:sz="4"/>
+              <w:left w:val="single" w:color="C9D2DF" w:sz="4"/>
+              <w:bottom w:val="single" w:color="C9D2DF" w:sz="4"/>
+              <w:right w:val="single" w:color="C9D2DF" w:sz="4"/>
+            </w:tcBorders>
+            <w:shd w:fill="EEF3F9" w:color="auto" w:val="clear"/>
+            <w:tcMar>
+              <w:top w:type="dxa" w:w="55"/>
+              <w:left w:type="dxa" w:w="90"/>
+              <w:bottom w:type="dxa" w:w="55"/>
+              <w:right w:type="dxa" w:w="90"/>
+            </w:tcMar>
+            <w:vAlign w:val="center"/>
+          </w:tcPr>
+          <w:p>
+            <w:pPr>
+              <w:keepNext w:val="false"/>
+              <w:jc w:val="left"/>
+            </w:pPr>
+            <w:r>
+              <w:rPr>
+                <w:rFonts w:ascii="Calibri" w:cs="Calibri" w:eastAsia="Calibri" w:hAnsi="Calibri"/>
+                <w:sz w:val="16"/>
+                <w:szCs w:val="16"/>
+              </w:rPr>
+              <w:t xml:space="preserve">33c90cc</w:t>
+            </w:r>
+          </w:p>
+        </w:tc>
+        <w:tc>
+          <w:tcPr>
+            <w:tcW w:type="dxa" w:w="1500"/>
+            <w:tcBorders>
+              <w:top w:val="single" w:color="C9D2DF" w:sz="4"/>
+              <w:left w:val="single" w:color="C9D2DF" w:sz="4"/>
+              <w:bottom w:val="single" w:color="C9D2DF" w:sz="4"/>
+              <w:right w:val="single" w:color="C9D2DF" w:sz="4"/>
+            </w:tcBorders>
+            <w:shd w:fill="EEF3F9" w:color="auto" w:val="clear"/>
+            <w:tcMar>
+              <w:top w:type="dxa" w:w="55"/>
+              <w:left w:type="dxa" w:w="90"/>
+              <w:bottom w:type="dxa" w:w="55"/>
+              <w:right w:type="dxa" w:w="90"/>
+            </w:tcMar>
+            <w:vAlign w:val="center"/>
+          </w:tcPr>
+          <w:p>
+            <w:pPr>
+              <w:keepNext w:val="false"/>
+              <w:jc w:val="left"/>
+            </w:pPr>
+            <w:r>
+              <w:rPr>
+                <w:rFonts w:ascii="Calibri" w:cs="Calibri" w:eastAsia="Calibri" w:hAnsi="Calibri"/>
+                <w:sz w:val="16"/>
+                <w:szCs w:val="16"/>
+              </w:rPr>
+              <w:t xml:space="preserve">Manas Saxena</w:t>
+            </w:r>
+          </w:p>
+        </w:tc>
+        <w:tc>
+          <w:tcPr>
+            <w:tcW w:type="dxa" w:w="1100"/>
+            <w:tcBorders>
+              <w:top w:val="single" w:color="C9D2DF" w:sz="4"/>
+              <w:left w:val="single" w:color="C9D2DF" w:sz="4"/>
+              <w:bottom w:val="single" w:color="C9D2DF" w:sz="4"/>
+              <w:right w:val="single" w:color="C9D2DF" w:sz="4"/>
+            </w:tcBorders>
+            <w:shd w:fill="EEF3F9" w:color="auto" w:val="clear"/>
+            <w:tcMar>
+              <w:top w:type="dxa" w:w="55"/>
+              <w:left w:type="dxa" w:w="90"/>
+              <w:bottom w:type="dxa" w:w="55"/>
+              <w:right w:type="dxa" w:w="90"/>
+            </w:tcMar>
+            <w:vAlign w:val="center"/>
+          </w:tcPr>
+          <w:p>
+            <w:pPr>
+              <w:keepNext w:val="false"/>
+              <w:jc w:val="left"/>
+            </w:pPr>
+            <w:r>
+              <w:rPr>
+                <w:rFonts w:ascii="Calibri" w:cs="Calibri" w:eastAsia="Calibri" w:hAnsi="Calibri"/>
+                <w:sz w:val="16"/>
+                <w:szCs w:val="16"/>
+              </w:rPr>
+              <w:t xml:space="preserve">2026-10-26</w:t>
+            </w:r>
+          </w:p>
+        </w:tc>
+        <w:tc>
+          <w:tcPr>
+            <w:tcW w:type="dxa" w:w="5526"/>
+            <w:tcBorders>
+              <w:top w:val="single" w:color="C9D2DF" w:sz="4"/>
+              <w:left w:val="single" w:color="C9D2DF" w:sz="4"/>
+              <w:bottom w:val="single" w:color="C9D2DF" w:sz="4"/>
+              <w:right w:val="single" w:color="C9D2DF" w:sz="4"/>
+            </w:tcBorders>
+            <w:shd w:fill="EEF3F9" w:color="auto" w:val="clear"/>
+            <w:tcMar>
+              <w:top w:type="dxa" w:w="55"/>
+              <w:left w:type="dxa" w:w="90"/>
+              <w:bottom w:type="dxa" w:w="55"/>
+              <w:right w:type="dxa" w:w="90"/>
+            </w:tcMar>
+            <w:vAlign w:val="center"/>
+          </w:tcPr>
+          <w:p>
+            <w:pPr>
+              <w:keepNext w:val="false"/>
+              <w:jc w:val="left"/>
+            </w:pPr>
+            <w:r>
+              <w:rPr>
+                <w:rFonts w:ascii="Calibri" w:cs="Calibri" w:eastAsia="Calibri" w:hAnsi="Calibri"/>
+                <w:sz w:val="16"/>
+                <w:szCs w:val="16"/>
+              </w:rPr>
+              <w:t xml:space="preserve">Add data-driven report generator</w:t>
+            </w:r>
+          </w:p>
+        </w:tc>
+      </w:tr>
+      <w:tr>
+        <w:trPr>
+          <w:cantSplit/>
+        </w:trPr>
+        <w:tc>
+          <w:tcPr>
+            <w:tcW w:type="dxa" w:w="900"/>
+            <w:tcBorders>
+              <w:top w:val="single" w:color="C9D2DF" w:sz="4"/>
+              <w:left w:val="single" w:color="C9D2DF" w:sz="4"/>
+              <w:bottom w:val="single" w:color="C9D2DF" w:sz="4"/>
+              <w:right w:val="single" w:color="C9D2DF" w:sz="4"/>
+            </w:tcBorders>
+            <w:tcMar>
+              <w:top w:type="dxa" w:w="55"/>
+              <w:left w:type="dxa" w:w="90"/>
+              <w:bottom w:type="dxa" w:w="55"/>
+              <w:right w:type="dxa" w:w="90"/>
+            </w:tcMar>
+            <w:vAlign w:val="center"/>
+          </w:tcPr>
+          <w:p>
+            <w:pPr>
+              <w:keepNext w:val="false"/>
+              <w:jc w:val="left"/>
+            </w:pPr>
+            <w:r>
+              <w:rPr>
+                <w:rFonts w:ascii="Calibri" w:cs="Calibri" w:eastAsia="Calibri" w:hAnsi="Calibri"/>
+                <w:sz w:val="16"/>
+                <w:szCs w:val="16"/>
+              </w:rPr>
+              <w:t xml:space="preserve">74cf9f1</w:t>
+            </w:r>
+          </w:p>
+        </w:tc>
+        <w:tc>
+          <w:tcPr>
+            <w:tcW w:type="dxa" w:w="1500"/>
+            <w:tcBorders>
+              <w:top w:val="single" w:color="C9D2DF" w:sz="4"/>
+              <w:left w:val="single" w:color="C9D2DF" w:sz="4"/>
+              <w:bottom w:val="single" w:color="C9D2DF" w:sz="4"/>
+              <w:right w:val="single" w:color="C9D2DF" w:sz="4"/>
+            </w:tcBorders>
+            <w:tcMar>
+              <w:top w:type="dxa" w:w="55"/>
+              <w:left w:type="dxa" w:w="90"/>
+              <w:bottom w:type="dxa" w:w="55"/>
+              <w:right w:type="dxa" w:w="90"/>
+            </w:tcMar>
+            <w:vAlign w:val="center"/>
+          </w:tcPr>
+          <w:p>
+            <w:pPr>
+              <w:keepNext w:val="false"/>
+              <w:jc w:val="left"/>
+            </w:pPr>
+            <w:r>
+              <w:rPr>
+                <w:rFonts w:ascii="Calibri" w:cs="Calibri" w:eastAsia="Calibri" w:hAnsi="Calibri"/>
+                <w:sz w:val="16"/>
+                <w:szCs w:val="16"/>
+              </w:rPr>
+              <w:t xml:space="preserve">Manas Saxena</w:t>
+            </w:r>
+          </w:p>
+        </w:tc>
+        <w:tc>
+          <w:tcPr>
+            <w:tcW w:type="dxa" w:w="1100"/>
+            <w:tcBorders>
+              <w:top w:val="single" w:color="C9D2DF" w:sz="4"/>
+              <w:left w:val="single" w:color="C9D2DF" w:sz="4"/>
+              <w:bottom w:val="single" w:color="C9D2DF" w:sz="4"/>
+              <w:right w:val="single" w:color="C9D2DF" w:sz="4"/>
+            </w:tcBorders>
+            <w:tcMar>
+              <w:top w:type="dxa" w:w="55"/>
+              <w:left w:type="dxa" w:w="90"/>
+              <w:bottom w:type="dxa" w:w="55"/>
+              <w:right w:type="dxa" w:w="90"/>
+            </w:tcMar>
+            <w:vAlign w:val="center"/>
+          </w:tcPr>
+          <w:p>
+            <w:pPr>
+              <w:keepNext w:val="false"/>
+              <w:jc w:val="left"/>
+            </w:pPr>
+            <w:r>
+              <w:rPr>
+                <w:rFonts w:ascii="Calibri" w:cs="Calibri" w:eastAsia="Calibri" w:hAnsi="Calibri"/>
+                <w:sz w:val="16"/>
+                <w:szCs w:val="16"/>
+              </w:rPr>
+              <w:t xml:space="preserve">2026-10-26</w:t>
+            </w:r>
+          </w:p>
+        </w:tc>
+        <w:tc>
+          <w:tcPr>
+            <w:tcW w:type="dxa" w:w="5526"/>
+            <w:tcBorders>
+              <w:top w:val="single" w:color="C9D2DF" w:sz="4"/>
+              <w:left w:val="single" w:color="C9D2DF" w:sz="4"/>
+              <w:bottom w:val="single" w:color="C9D2DF" w:sz="4"/>
+              <w:right w:val="single" w:color="C9D2DF" w:sz="4"/>
+            </w:tcBorders>
+            <w:tcMar>
+              <w:top w:type="dxa" w:w="55"/>
+              <w:left w:type="dxa" w:w="90"/>
+              <w:bottom w:type="dxa" w:w="55"/>
+              <w:right w:type="dxa" w:w="90"/>
+            </w:tcMar>
+            <w:vAlign w:val="center"/>
+          </w:tcPr>
+          <w:p>
+            <w:pPr>
+              <w:keepNext w:val="false"/>
+              <w:jc w:val="left"/>
+            </w:pPr>
+            <w:r>
+              <w:rPr>
+                <w:rFonts w:ascii="Calibri" w:cs="Calibri" w:eastAsia="Calibri" w:hAnsi="Calibri"/>
+                <w:sz w:val="16"/>
+                <w:szCs w:val="16"/>
+              </w:rPr>
+              <w:t xml:space="preserve">Add full project report (Word and PDF)</w:t>
             </w:r>
           </w:p>
         </w:tc>

</xml_diff>